<commit_message>
TS 4.1 -4.7 Tamil Pada paatam with vAkyam
</commit_message>
<xml_diff>
--- a/saMhitA/04/TS 4 Tamil Corrections.docx
+++ b/saMhitA/04/TS 4 Tamil Corrections.docx
@@ -315,17 +315,7 @@
                 <w:szCs w:val="28"/>
                 <w:lang w:bidi="ta-IN"/>
               </w:rPr>
-              <w:t xml:space="preserve">Line </w:t>
-            </w:r>
-            <w:r>
-              <w:rPr>
-                <w:rFonts w:cs="Latha"/>
-                <w:b/>
-                <w:sz w:val="28"/>
-                <w:szCs w:val="28"/>
-                <w:lang w:bidi="ta-IN"/>
-              </w:rPr>
-              <w:t>5</w:t>
+              <w:t>Line 5</w:t>
             </w:r>
           </w:p>
           <w:p>
@@ -676,10 +666,7 @@
           <w:u w:val="single"/>
         </w:rPr>
       </w:pPr>
-    </w:p>
-    <w:p>
-      <w:pPr>
-        <w:jc w:val="center"/>
+      <w:r>
         <w:rPr>
           <w:b/>
           <w:bCs/>
@@ -687,19 +674,8 @@
           <w:szCs w:val="32"/>
           <w:u w:val="single"/>
         </w:rPr>
-      </w:pPr>
-    </w:p>
-    <w:p>
-      <w:pPr>
-        <w:jc w:val="center"/>
-        <w:rPr>
-          <w:b/>
-          <w:bCs/>
-          <w:sz w:val="32"/>
-          <w:szCs w:val="32"/>
-          <w:u w:val="single"/>
-        </w:rPr>
-      </w:pPr>
+        <w:t>=======================</w:t>
+      </w:r>
     </w:p>
     <w:p>
       <w:pPr>
@@ -2081,7 +2057,6 @@
                 <w:szCs w:val="28"/>
                 <w:lang w:bidi="ta-IN"/>
               </w:rPr>
-              <w:lastRenderedPageBreak/>
               <w:t>TS 4.</w:t>
             </w:r>
             <w:r>
@@ -2321,6 +2296,7 @@
                 <w:cs/>
                 <w:lang w:bidi="ta-IN"/>
               </w:rPr>
+              <w:lastRenderedPageBreak/>
               <w:t>ஏ</w:t>
             </w:r>
             <w:r>
@@ -2600,6 +2576,7 @@
                 <w:cs/>
                 <w:lang w:bidi="ta-IN"/>
               </w:rPr>
+              <w:lastRenderedPageBreak/>
               <w:t>விஷ்டா</w:t>
             </w:r>
             <w:r>
@@ -2689,6 +2666,7 @@
                 <w:cs/>
                 <w:lang w:bidi="ta-IN"/>
               </w:rPr>
+              <w:lastRenderedPageBreak/>
               <w:t>ஏ</w:t>
             </w:r>
             <w:r>
@@ -3001,6 +2979,7 @@
                 <w:szCs w:val="28"/>
                 <w:lang w:bidi="ta-IN"/>
               </w:rPr>
+              <w:lastRenderedPageBreak/>
               <w:t>TS 4.</w:t>
             </w:r>
             <w:r>
@@ -5366,7 +5345,6 @@
                 <w:szCs w:val="28"/>
                 <w:lang w:eastAsia="en-IN" w:bidi="ml-IN"/>
               </w:rPr>
-              <w:lastRenderedPageBreak/>
               <w:t>TS 4.</w:t>
             </w:r>
             <w:r>
@@ -5870,6 +5848,7 @@
                 <w:szCs w:val="28"/>
                 <w:lang w:bidi="ta-IN"/>
               </w:rPr>
+              <w:lastRenderedPageBreak/>
               <w:t>TS 4.2.</w:t>
             </w:r>
             <w:r>
@@ -7655,7 +7634,6 @@
                 <w:szCs w:val="28"/>
                 <w:lang w:bidi="ta-IN"/>
               </w:rPr>
-              <w:lastRenderedPageBreak/>
               <w:t>TS 4.1.10.4 - Vaakyam</w:t>
             </w:r>
           </w:p>
@@ -8069,6 +8047,7 @@
                 <w:szCs w:val="28"/>
                 <w:lang w:bidi="ta-IN"/>
               </w:rPr>
+              <w:lastRenderedPageBreak/>
               <w:t>TS 4.4.2.1 - Vaakyam</w:t>
             </w:r>
           </w:p>
@@ -10289,7 +10268,6 @@
                 <w:szCs w:val="28"/>
                 <w:lang w:bidi="ta-IN"/>
               </w:rPr>
-              <w:lastRenderedPageBreak/>
               <w:t>TS 4.2.3.2</w:t>
             </w:r>
           </w:p>
@@ -10688,6 +10666,7 @@
                 <w:szCs w:val="28"/>
                 <w:lang w:bidi="ta-IN"/>
               </w:rPr>
+              <w:lastRenderedPageBreak/>
               <w:t>TS 4.2.9</w:t>
             </w:r>
             <w:r>
@@ -13288,7 +13267,6 @@
                 <w:cs/>
                 <w:lang w:bidi="ta-IN"/>
               </w:rPr>
-              <w:lastRenderedPageBreak/>
               <w:t>ஜ</w:t>
             </w:r>
             <w:r>
@@ -13429,7 +13407,6 @@
                 <w:cs/>
                 <w:lang w:bidi="ta-IN"/>
               </w:rPr>
-              <w:lastRenderedPageBreak/>
               <w:t>வை</w:t>
             </w:r>
             <w:r>
@@ -13707,6 +13684,7 @@
                 <w:szCs w:val="28"/>
                 <w:lang w:bidi="ta-IN"/>
               </w:rPr>
+              <w:lastRenderedPageBreak/>
               <w:t>TS 4.3.5.1</w:t>
             </w:r>
           </w:p>
@@ -16454,7 +16432,6 @@
                 <w:cs/>
                 <w:lang w:bidi="ta-IN"/>
               </w:rPr>
-              <w:lastRenderedPageBreak/>
               <w:t>ஸ்தப்</w:t>
             </w:r>
             <w:r>
@@ -16508,7 +16485,6 @@
                 <w:cs/>
                 <w:lang w:bidi="ta-IN"/>
               </w:rPr>
-              <w:lastRenderedPageBreak/>
               <w:t>ப்ர</w:t>
             </w:r>
             <w:r>
@@ -16748,6 +16724,7 @@
                 <w:szCs w:val="28"/>
                 <w:lang w:bidi="ta-IN"/>
               </w:rPr>
+              <w:lastRenderedPageBreak/>
               <w:t>TS 4.4.2.2</w:t>
             </w:r>
           </w:p>
@@ -19326,7 +19303,6 @@
                 <w:szCs w:val="28"/>
                 <w:lang w:bidi="ta-IN"/>
               </w:rPr>
-              <w:lastRenderedPageBreak/>
               <w:t>TS 4.</w:t>
             </w:r>
             <w:r>
@@ -19838,6 +19814,7 @@
                 <w:szCs w:val="28"/>
                 <w:lang w:bidi="ta-IN"/>
               </w:rPr>
+              <w:lastRenderedPageBreak/>
               <w:t>TS 4.</w:t>
             </w:r>
             <w:r>

</xml_diff>